<commit_message>
UI classes mega roll on party
</commit_message>
<xml_diff>
--- a/TheProspector/Assets/Docs/Related School Work/LUT/The Scrap Book.docx
+++ b/TheProspector/Assets/Docs/Related School Work/LUT/The Scrap Book.docx
@@ -182,7 +182,7 @@
           <w:lang w:val="en-GB"/>
         </w:rPr>
         <w:pict w14:anchorId="346B21C2">
-          <v:rect id="_x0000_i1073" style="width:0;height:1.5pt" o:hralign="center" o:hrstd="t" o:hr="t" fillcolor="#a0a0a0" stroked="f"/>
+          <v:rect id="_x0000_i1025" style="width:0;height:1.5pt" o:hralign="center" o:hrstd="t" o:hr="t" fillcolor="#a0a0a0" stroked="f"/>
         </w:pict>
       </w:r>
     </w:p>
@@ -367,7 +367,7 @@
           <w:lang w:val="en-GB"/>
         </w:rPr>
         <w:pict w14:anchorId="0CFAD1F1">
-          <v:rect id="_x0000_i1074" style="width:0;height:1.5pt" o:hralign="center" o:hrstd="t" o:hr="t" fillcolor="#a0a0a0" stroked="f"/>
+          <v:rect id="_x0000_i1026" style="width:0;height:1.5pt" o:hralign="center" o:hrstd="t" o:hr="t" fillcolor="#a0a0a0" stroked="f"/>
         </w:pict>
       </w:r>
     </w:p>
@@ -538,7 +538,7 @@
           <w:lang w:val="en-GB"/>
         </w:rPr>
         <w:pict w14:anchorId="0D54C273">
-          <v:rect id="_x0000_i1075" style="width:0;height:1.5pt" o:hralign="center" o:hrstd="t" o:hr="t" fillcolor="#a0a0a0" stroked="f"/>
+          <v:rect id="_x0000_i1027" style="width:0;height:1.5pt" o:hralign="center" o:hrstd="t" o:hr="t" fillcolor="#a0a0a0" stroked="f"/>
         </w:pict>
       </w:r>
     </w:p>
@@ -732,7 +732,7 @@
           <w:lang w:val="en-GB"/>
         </w:rPr>
         <w:pict w14:anchorId="07B47C97">
-          <v:rect id="_x0000_i1076" style="width:0;height:1.5pt" o:hralign="center" o:hrstd="t" o:hr="t" fillcolor="#a0a0a0" stroked="f"/>
+          <v:rect id="_x0000_i1028" style="width:0;height:1.5pt" o:hralign="center" o:hrstd="t" o:hr="t" fillcolor="#a0a0a0" stroked="f"/>
         </w:pict>
       </w:r>
     </w:p>
@@ -959,7 +959,7 @@
           <w:lang w:val="en-GB"/>
         </w:rPr>
         <w:pict w14:anchorId="321C52EC">
-          <v:rect id="_x0000_i1077" style="width:0;height:1.5pt" o:hralign="center" o:hrstd="t" o:hr="t" fillcolor="#a0a0a0" stroked="f"/>
+          <v:rect id="_x0000_i1029" style="width:0;height:1.5pt" o:hralign="center" o:hrstd="t" o:hr="t" fillcolor="#a0a0a0" stroked="f"/>
         </w:pict>
       </w:r>
     </w:p>
@@ -1227,7 +1227,7 @@
           <w:lang w:val="en-GB"/>
         </w:rPr>
         <w:pict w14:anchorId="03A5E5B4">
-          <v:rect id="_x0000_i1078" style="width:0;height:1.5pt" o:hralign="center" o:hrstd="t" o:hr="t" fillcolor="#a0a0a0" stroked="f"/>
+          <v:rect id="_x0000_i1030" style="width:0;height:1.5pt" o:hralign="center" o:hrstd="t" o:hr="t" fillcolor="#a0a0a0" stroked="f"/>
         </w:pict>
       </w:r>
     </w:p>
@@ -1397,7 +1397,7 @@
           <w:lang w:val="en-GB"/>
         </w:rPr>
         <w:pict w14:anchorId="0E69E630">
-          <v:rect id="_x0000_i1079" style="width:0;height:1.5pt" o:hralign="center" o:hrstd="t" o:hr="t" fillcolor="#a0a0a0" stroked="f"/>
+          <v:rect id="_x0000_i1031" style="width:0;height:1.5pt" o:hralign="center" o:hrstd="t" o:hr="t" fillcolor="#a0a0a0" stroked="f"/>
         </w:pict>
       </w:r>
     </w:p>
@@ -1606,7 +1606,7 @@
           <w:lang w:val="en-GB"/>
         </w:rPr>
         <w:pict w14:anchorId="0FB070F8">
-          <v:rect id="_x0000_i1080" style="width:0;height:1.5pt" o:hralign="center" o:hrstd="t" o:hr="t" fillcolor="#a0a0a0" stroked="f"/>
+          <v:rect id="_x0000_i1032" style="width:0;height:1.5pt" o:hralign="center" o:hrstd="t" o:hr="t" fillcolor="#a0a0a0" stroked="f"/>
         </w:pict>
       </w:r>
     </w:p>
@@ -1774,6 +1774,245 @@
         </w:rPr>
         <w:t>Palette for concept art, menus, and UI theme.</w:t>
       </w:r>
+    </w:p>
+    <w:p>
+      <w:pPr>
+        <w:rPr>
+          <w:lang w:val="en-GB"/>
+        </w:rPr>
+      </w:pPr>
+    </w:p>
+    <w:p>
+      <w:pPr>
+        <w:rPr>
+          <w:lang w:val="en-GB"/>
+        </w:rPr>
+      </w:pPr>
+      <w:r>
+        <w:rPr>
+          <w:lang w:val="en-GB"/>
+        </w:rPr>
+        <w:pict w14:anchorId="29FFDD73">
+          <v:rect id="_x0000_i1033" style="width:0;height:1.5pt" o:hralign="center" o:hrstd="t" o:hr="t" fillcolor="#a0a0a0" stroked="f"/>
+        </w:pict>
+      </w:r>
+    </w:p>
+    <w:p>
+      <w:pPr>
+        <w:rPr>
+          <w:b/>
+          <w:bCs/>
+          <w:lang w:val="en-GB"/>
+        </w:rPr>
+      </w:pPr>
+      <w:r>
+        <w:rPr>
+          <w:b/>
+          <w:bCs/>
+          <w:lang w:val="en-GB"/>
+        </w:rPr>
+        <w:t>SB-0</w:t>
+      </w:r>
+      <w:r>
+        <w:rPr>
+          <w:b/>
+          <w:bCs/>
+          <w:lang w:val="en-GB"/>
+        </w:rPr>
+        <w:t>10</w:t>
+      </w:r>
+      <w:r>
+        <w:rPr>
+          <w:b/>
+          <w:bCs/>
+          <w:lang w:val="en-GB"/>
+        </w:rPr>
+        <w:t xml:space="preserve"> – </w:t>
+      </w:r>
+      <w:r>
+        <w:rPr>
+          <w:b/>
+          <w:bCs/>
+          <w:lang w:val="en-GB"/>
+        </w:rPr>
+        <w:t>Note on UI DESIGN</w:t>
+      </w:r>
+      <w:r>
+        <w:rPr>
+          <w:b/>
+          <w:bCs/>
+          <w:lang w:val="en-GB"/>
+        </w:rPr>
+        <w:t xml:space="preserve"> and Camera LOGIC</w:t>
+      </w:r>
+    </w:p>
+    <w:p>
+      <w:pPr>
+        <w:numPr>
+          <w:ilvl w:val="0"/>
+          <w:numId w:val="10"/>
+        </w:numPr>
+        <w:rPr>
+          <w:lang w:val="en-GB"/>
+        </w:rPr>
+      </w:pPr>
+      <w:r>
+        <w:rPr>
+          <w:b/>
+          <w:bCs/>
+          <w:lang w:val="en-GB"/>
+        </w:rPr>
+        <w:t>Theme:</w:t>
+      </w:r>
+      <w:r>
+        <w:rPr>
+          <w:lang w:val="en-GB"/>
+        </w:rPr>
+        <w:t xml:space="preserve"> </w:t>
+      </w:r>
+      <w:r>
+        <w:rPr>
+          <w:lang w:val="en-GB"/>
+        </w:rPr>
+        <w:t>Gadget with ease-in actions</w:t>
+      </w:r>
+    </w:p>
+    <w:p>
+      <w:pPr>
+        <w:numPr>
+          <w:ilvl w:val="0"/>
+          <w:numId w:val="10"/>
+        </w:numPr>
+        <w:rPr>
+          <w:lang w:val="en-GB"/>
+        </w:rPr>
+      </w:pPr>
+      <w:r>
+        <w:rPr>
+          <w:b/>
+          <w:bCs/>
+          <w:lang w:val="en-GB"/>
+        </w:rPr>
+        <w:t>Notes:</w:t>
+      </w:r>
+    </w:p>
+    <w:p>
+      <w:pPr>
+        <w:numPr>
+          <w:ilvl w:val="1"/>
+          <w:numId w:val="10"/>
+        </w:numPr>
+        <w:rPr>
+          <w:lang w:val="en-GB"/>
+        </w:rPr>
+      </w:pPr>
+      <w:r>
+        <w:rPr>
+          <w:lang w:val="en-GB"/>
+        </w:rPr>
+        <w:t>When the actual design and implementation is further, I want the UI screens to work on two actions:</w:t>
+      </w:r>
+    </w:p>
+    <w:p>
+      <w:pPr>
+        <w:numPr>
+          <w:ilvl w:val="2"/>
+          <w:numId w:val="10"/>
+        </w:numPr>
+        <w:rPr>
+          <w:lang w:val="en-GB"/>
+        </w:rPr>
+      </w:pPr>
+      <w:r>
+        <w:rPr>
+          <w:lang w:val="en-GB"/>
+        </w:rPr>
+        <w:t>Action 1: collapsing in with a crush</w:t>
+      </w:r>
+    </w:p>
+    <w:p>
+      <w:pPr>
+        <w:numPr>
+          <w:ilvl w:val="2"/>
+          <w:numId w:val="10"/>
+        </w:numPr>
+        <w:rPr>
+          <w:lang w:val="en-GB"/>
+        </w:rPr>
+      </w:pPr>
+      <w:r>
+        <w:rPr>
+          <w:lang w:val="en-GB"/>
+        </w:rPr>
+        <w:lastRenderedPageBreak/>
+        <w:t xml:space="preserve">Action 2: Involve an off-screen part, when necessary, where the camera pans after action 1. </w:t>
+      </w:r>
+    </w:p>
+    <w:p>
+      <w:pPr>
+        <w:numPr>
+          <w:ilvl w:val="2"/>
+          <w:numId w:val="10"/>
+        </w:numPr>
+        <w:rPr>
+          <w:lang w:val="en-GB"/>
+        </w:rPr>
+      </w:pPr>
+      <w:r>
+        <w:rPr>
+          <w:lang w:val="en-GB"/>
+        </w:rPr>
+        <w:t>For example, rehearsal view’s menu bar crashes to the right side at the same space reserved for all the other action bars, after which the camera pans to the right so the right-side menu bar turns into a left side menu bar and the rehearsal space is revealed.</w:t>
+      </w:r>
+      <w:r>
+        <w:rPr>
+          <w:lang w:val="en-GB"/>
+        </w:rPr>
+        <w:t xml:space="preserve"> At the same time, the camera gets shaky as if held by an actual person recording what is taking place in the rehearsal space.</w:t>
+      </w:r>
+    </w:p>
+    <w:p>
+      <w:pPr>
+        <w:numPr>
+          <w:ilvl w:val="0"/>
+          <w:numId w:val="10"/>
+        </w:numPr>
+        <w:rPr>
+          <w:lang w:val="en-GB"/>
+        </w:rPr>
+      </w:pPr>
+      <w:r>
+        <w:rPr>
+          <w:b/>
+          <w:bCs/>
+          <w:lang w:val="en-GB"/>
+        </w:rPr>
+        <w:t>Use:</w:t>
+      </w:r>
+    </w:p>
+    <w:p>
+      <w:pPr>
+        <w:numPr>
+          <w:ilvl w:val="1"/>
+          <w:numId w:val="10"/>
+        </w:numPr>
+        <w:rPr>
+          <w:lang w:val="en-GB"/>
+        </w:rPr>
+      </w:pPr>
+      <w:r>
+        <w:rPr>
+          <w:lang w:val="en-GB"/>
+        </w:rPr>
+        <w:t>serves as a bridge in narration: Menu action -&gt; change of scenery and feeling</w:t>
+      </w:r>
+    </w:p>
+    <w:p>
+      <w:pPr>
+        <w:rPr>
+          <w:lang w:val="en-GB"/>
+        </w:rPr>
+      </w:pPr>
     </w:p>
     <w:p>
       <w:pPr>
@@ -3018,7 +3257,7 @@
         <w:sz w:val="20"/>
       </w:rPr>
     </w:lvl>
-    <w:lvl w:ilvl="2" w:tentative="1">
+    <w:lvl w:ilvl="2">
       <w:start w:val="1"/>
       <w:numFmt w:val="bullet"/>
       <w:lvlText w:val=""/>
@@ -3784,6 +4023,7 @@
   <w:style w:type="character" w:default="1" w:styleId="Kappaleenoletusfontti">
     <w:name w:val="Default Paragraph Font"/>
     <w:uiPriority w:val="1"/>
+    <w:semiHidden/>
     <w:unhideWhenUsed/>
   </w:style>
   <w:style w:type="table" w:default="1" w:styleId="Normaalitaulukko">

</xml_diff>